<commit_message>
Added screenshots and guide update
</commit_message>
<xml_diff>
--- a/docs/Svea_Payments_Finland_for_WooCommerce_manual.docx
+++ b/docs/Svea_Payments_Finland_for_WooCommerce_manual.docx
@@ -388,7 +388,7 @@
           <w:szCs w:val="22"/>
         </w:rPr>
         <w:drawing>
-          <wp:inline distT="0" distB="0" distL="0" distR="0" wp14:anchorId="683FF40B" wp14:editId="114D319D">
+          <wp:inline distT="0" distB="0" distL="0" distR="0" wp14:anchorId="683FF40B" wp14:editId="4176AD27">
             <wp:extent cx="2000816" cy="2000816"/>
             <wp:effectExtent l="0" t="0" r="6350" b="6350"/>
             <wp:docPr id="326693259" name="Picture 1"/>
@@ -4833,14 +4833,6 @@
     </w:p>
     <w:p>
       <w:pPr>
-        <w:pStyle w:val="Textbody"/>
-      </w:pPr>
-      <w:r>
-        <w:t>Your Seller id and Secret Key are ignored when using the Sandbox mode.</w:t>
-      </w:r>
-    </w:p>
-    <w:p>
-      <w:pPr>
         <w:pStyle w:val="Heading2"/>
       </w:pPr>
       <w:bookmarkStart w:id="108" w:name="_Toc11353208"/>
@@ -4852,6 +4844,9 @@
       <w:bookmarkStart w:id="114" w:name="_Toc10646653"/>
       <w:bookmarkStart w:id="115" w:name="_Toc242215721"/>
       <w:r>
+        <w:t xml:space="preserve"> </w:t>
+      </w:r>
+      <w:r>
         <w:t>Payment</w:t>
       </w:r>
       <w:r>
@@ -4961,6 +4956,9 @@
       </w:pPr>
       <w:bookmarkStart w:id="117" w:name="_Toc242215723"/>
       <w:r>
+        <w:t xml:space="preserve"> </w:t>
+      </w:r>
+      <w:r>
         <w:t>Send delivery confirmation only for specific payment methods</w:t>
       </w:r>
       <w:bookmarkEnd w:id="117"/>
@@ -5052,6 +5050,9 @@
       <w:bookmarkStart w:id="118" w:name="_Toc242215724"/>
       <w:r>
         <w:lastRenderedPageBreak/>
+        <w:t xml:space="preserve"> </w:t>
+      </w:r>
+      <w:r>
         <w:t>Part Payment widget</w:t>
       </w:r>
       <w:bookmarkEnd w:id="118"/>
@@ -6730,12 +6731,8 @@
       </w:pPr>
     </w:p>
     <w:sectPr>
-      <w:headerReference w:type="even" r:id="rId37"/>
-      <w:headerReference w:type="default" r:id="rId38"/>
-      <w:footerReference w:type="even" r:id="rId39"/>
-      <w:footerReference w:type="default" r:id="rId40"/>
-      <w:headerReference w:type="first" r:id="rId41"/>
-      <w:footerReference w:type="first" r:id="rId42"/>
+      <w:headerReference w:type="default" r:id="rId37"/>
+      <w:footerReference w:type="default" r:id="rId38"/>
       <w:pgSz w:w="11906" w:h="16838"/>
       <w:pgMar w:top="1702" w:right="1416" w:bottom="1258" w:left="851" w:header="900" w:footer="125" w:gutter="0"/>
       <w:cols w:space="708"/>
@@ -6765,16 +6762,6 @@
 </file>
 
 <file path=word/footer1.xml><?xml version="1.0" encoding="utf-8"?>
-<w:ftr xmlns:wpc="http://schemas.microsoft.com/office/word/2010/wordprocessingCanvas" xmlns:cx="http://schemas.microsoft.com/office/drawing/2014/chartex" xmlns:cx1="http://schemas.microsoft.com/office/drawing/2015/9/8/chartex" xmlns:cx2="http://schemas.microsoft.com/office/drawing/2015/10/21/chartex" xmlns:cx3="http://schemas.microsoft.com/office/drawing/2016/5/9/chartex" xmlns:cx4="http://schemas.microsoft.com/office/drawing/2016/5/10/chartex" xmlns:cx5="http://schemas.microsoft.com/office/drawing/2016/5/11/chartex" xmlns:cx6="http://schemas.microsoft.com/office/drawing/2016/5/12/chartex" xmlns:cx7="http://schemas.microsoft.com/office/drawing/2016/5/13/chartex" xmlns:cx8="http://schemas.microsoft.com/office/drawing/2016/5/14/chartex" xmlns:mc="http://schemas.openxmlformats.org/markup-compatibility/2006" xmlns:m="http://schemas.openxmlformats.org/officeDocument/2006/math" xmlns:aink="http://schemas.microsoft.com/office/drawing/2016/ink" xmlns:am3d="http://schemas.microsoft.com/office/drawing/2017/model3d" xmlns:oel="http://schemas.microsoft.com/office/2019/extlst" xmlns:r="http://schemas.openxmlformats.org/officeDocument/2006/relationships" xmlns:wp14="http://schemas.microsoft.com/office/word/2010/wordprocessingDrawing" xmlns:wp="http://schemas.openxmlformats.org/drawingml/2006/wordprocessingDrawing" xmlns:wpg="http://schemas.microsoft.com/office/word/2010/wordprocessingGroup" xmlns:wpi="http://schemas.microsoft.com/office/word/2010/wordprocessingInk" xmlns:wps="http://schemas.microsoft.com/office/word/2010/wordprocessingShape" xmlns:o="urn:schemas-microsoft-com:office:office" xmlns:v="urn:schemas-microsoft-com:vml" xmlns:w10="urn:schemas-microsoft-com:office:word" xmlns:w="http://schemas.openxmlformats.org/wordprocessingml/2006/main" xmlns:w14="http://schemas.microsoft.com/office/word/2010/wordml" xmlns:w15="http://schemas.microsoft.com/office/word/2012/wordml" xmlns:w16cex="http://schemas.microsoft.com/office/word/2018/wordml/cex" xmlns:w16cid="http://schemas.microsoft.com/office/word/2016/wordml/cid" xmlns:w16="http://schemas.microsoft.com/office/word/2018/wordml" xmlns:w16sdtdh="http://schemas.microsoft.com/office/word/2020/wordml/sdtdatahash" xmlns:w16sdtfl="http://schemas.microsoft.com/office/word/2024/wordml/sdtformatlock" xmlns:w16se="http://schemas.microsoft.com/office/word/2015/wordml/symex" xmlns:w16du="http://schemas.microsoft.com/office/word/2023/wordml/word16du" xmlns:wne="http://schemas.microsoft.com/office/word/2006/wordml" mc:Ignorable="w14 w15 w16se w16cid w16 w16cex w16sdtdh w16sdtfl w16du wp14">
-  <w:p>
-    <w:pPr>
-      <w:pStyle w:val="Footer"/>
-    </w:pPr>
-  </w:p>
-</w:ftr>
-</file>
-
-<file path=word/footer2.xml><?xml version="1.0" encoding="utf-8"?>
 <w:ftr xmlns:wpc="http://schemas.microsoft.com/office/word/2010/wordprocessingCanvas" xmlns:cx="http://schemas.microsoft.com/office/drawing/2014/chartex" xmlns:cx1="http://schemas.microsoft.com/office/drawing/2015/9/8/chartex" xmlns:cx2="http://schemas.microsoft.com/office/drawing/2015/10/21/chartex" xmlns:cx3="http://schemas.microsoft.com/office/drawing/2016/5/9/chartex" xmlns:cx4="http://schemas.microsoft.com/office/drawing/2016/5/10/chartex" xmlns:cx5="http://schemas.microsoft.com/office/drawing/2016/5/11/chartex" xmlns:cx6="http://schemas.microsoft.com/office/drawing/2016/5/12/chartex" xmlns:cx7="http://schemas.microsoft.com/office/drawing/2016/5/13/chartex" xmlns:cx8="http://schemas.microsoft.com/office/drawing/2016/5/14/chartex" xmlns:mc="http://schemas.openxmlformats.org/markup-compatibility/2006" xmlns:m="http://schemas.openxmlformats.org/officeDocument/2006/math" xmlns:aink="http://schemas.microsoft.com/office/drawing/2016/ink" xmlns:am3d="http://schemas.microsoft.com/office/drawing/2017/model3d" xmlns:oel="http://schemas.microsoft.com/office/2019/extlst" xmlns:r="http://schemas.openxmlformats.org/officeDocument/2006/relationships" xmlns:wp14="http://schemas.microsoft.com/office/word/2010/wordprocessingDrawing" xmlns:wp="http://schemas.openxmlformats.org/drawingml/2006/wordprocessingDrawing" xmlns:wpg="http://schemas.microsoft.com/office/word/2010/wordprocessingGroup" xmlns:wpi="http://schemas.microsoft.com/office/word/2010/wordprocessingInk" xmlns:wps="http://schemas.microsoft.com/office/word/2010/wordprocessingShape" xmlns:o="urn:schemas-microsoft-com:office:office" xmlns:v="urn:schemas-microsoft-com:vml" xmlns:w10="urn:schemas-microsoft-com:office:word" xmlns:w="http://schemas.openxmlformats.org/wordprocessingml/2006/main" xmlns:w14="http://schemas.microsoft.com/office/word/2010/wordml" xmlns:w15="http://schemas.microsoft.com/office/word/2012/wordml" xmlns:w16cex="http://schemas.microsoft.com/office/word/2018/wordml/cex" xmlns:w16cid="http://schemas.microsoft.com/office/word/2016/wordml/cid" xmlns:w16="http://schemas.microsoft.com/office/word/2018/wordml" xmlns:w16sdtdh="http://schemas.microsoft.com/office/word/2020/wordml/sdtdatahash" xmlns:w16sdtfl="http://schemas.microsoft.com/office/word/2024/wordml/sdtformatlock" xmlns:w16se="http://schemas.microsoft.com/office/word/2015/wordml/symex" xmlns:w16du="http://schemas.microsoft.com/office/word/2023/wordml/word16du" xmlns:wne="http://schemas.microsoft.com/office/word/2006/wordml" mc:Ignorable="w14 w15 w16se w16cid w16 w16cex w16sdtdh w16sdtfl w16du wp14">
   <w:tbl>
     <w:tblPr>
@@ -7098,16 +7085,6 @@
 </w:ftr>
 </file>
 
-<file path=word/footer3.xml><?xml version="1.0" encoding="utf-8"?>
-<w:ftr xmlns:wpc="http://schemas.microsoft.com/office/word/2010/wordprocessingCanvas" xmlns:cx="http://schemas.microsoft.com/office/drawing/2014/chartex" xmlns:cx1="http://schemas.microsoft.com/office/drawing/2015/9/8/chartex" xmlns:cx2="http://schemas.microsoft.com/office/drawing/2015/10/21/chartex" xmlns:cx3="http://schemas.microsoft.com/office/drawing/2016/5/9/chartex" xmlns:cx4="http://schemas.microsoft.com/office/drawing/2016/5/10/chartex" xmlns:cx5="http://schemas.microsoft.com/office/drawing/2016/5/11/chartex" xmlns:cx6="http://schemas.microsoft.com/office/drawing/2016/5/12/chartex" xmlns:cx7="http://schemas.microsoft.com/office/drawing/2016/5/13/chartex" xmlns:cx8="http://schemas.microsoft.com/office/drawing/2016/5/14/chartex" xmlns:mc="http://schemas.openxmlformats.org/markup-compatibility/2006" xmlns:m="http://schemas.openxmlformats.org/officeDocument/2006/math" xmlns:aink="http://schemas.microsoft.com/office/drawing/2016/ink" xmlns:am3d="http://schemas.microsoft.com/office/drawing/2017/model3d" xmlns:oel="http://schemas.microsoft.com/office/2019/extlst" xmlns:r="http://schemas.openxmlformats.org/officeDocument/2006/relationships" xmlns:wp14="http://schemas.microsoft.com/office/word/2010/wordprocessingDrawing" xmlns:wp="http://schemas.openxmlformats.org/drawingml/2006/wordprocessingDrawing" xmlns:wpg="http://schemas.microsoft.com/office/word/2010/wordprocessingGroup" xmlns:wpi="http://schemas.microsoft.com/office/word/2010/wordprocessingInk" xmlns:wps="http://schemas.microsoft.com/office/word/2010/wordprocessingShape" xmlns:o="urn:schemas-microsoft-com:office:office" xmlns:v="urn:schemas-microsoft-com:vml" xmlns:w10="urn:schemas-microsoft-com:office:word" xmlns:w="http://schemas.openxmlformats.org/wordprocessingml/2006/main" xmlns:w14="http://schemas.microsoft.com/office/word/2010/wordml" xmlns:w15="http://schemas.microsoft.com/office/word/2012/wordml" xmlns:w16cex="http://schemas.microsoft.com/office/word/2018/wordml/cex" xmlns:w16cid="http://schemas.microsoft.com/office/word/2016/wordml/cid" xmlns:w16="http://schemas.microsoft.com/office/word/2018/wordml" xmlns:w16sdtdh="http://schemas.microsoft.com/office/word/2020/wordml/sdtdatahash" xmlns:w16sdtfl="http://schemas.microsoft.com/office/word/2024/wordml/sdtformatlock" xmlns:w16se="http://schemas.microsoft.com/office/word/2015/wordml/symex" xmlns:w16du="http://schemas.microsoft.com/office/word/2023/wordml/word16du" xmlns:wne="http://schemas.microsoft.com/office/word/2006/wordml" mc:Ignorable="w14 w15 w16se w16cid w16 w16cex w16sdtdh w16sdtfl w16du wp14">
-  <w:p>
-    <w:pPr>
-      <w:pStyle w:val="Footer"/>
-    </w:pPr>
-  </w:p>
-</w:ftr>
-</file>
-
 <file path=word/footnotes.xml><?xml version="1.0" encoding="utf-8"?>
 <w:footnotes xmlns:wpc="http://schemas.microsoft.com/office/word/2010/wordprocessingCanvas" xmlns:cx="http://schemas.microsoft.com/office/drawing/2014/chartex" xmlns:cx1="http://schemas.microsoft.com/office/drawing/2015/9/8/chartex" xmlns:cx2="http://schemas.microsoft.com/office/drawing/2015/10/21/chartex" xmlns:cx3="http://schemas.microsoft.com/office/drawing/2016/5/9/chartex" xmlns:cx4="http://schemas.microsoft.com/office/drawing/2016/5/10/chartex" xmlns:cx5="http://schemas.microsoft.com/office/drawing/2016/5/11/chartex" xmlns:cx6="http://schemas.microsoft.com/office/drawing/2016/5/12/chartex" xmlns:cx7="http://schemas.microsoft.com/office/drawing/2016/5/13/chartex" xmlns:cx8="http://schemas.microsoft.com/office/drawing/2016/5/14/chartex" xmlns:mc="http://schemas.openxmlformats.org/markup-compatibility/2006" xmlns:m="http://schemas.openxmlformats.org/officeDocument/2006/math" xmlns:aink="http://schemas.microsoft.com/office/drawing/2016/ink" xmlns:am3d="http://schemas.microsoft.com/office/drawing/2017/model3d" xmlns:oel="http://schemas.microsoft.com/office/2019/extlst" xmlns:r="http://schemas.openxmlformats.org/officeDocument/2006/relationships" xmlns:wp14="http://schemas.microsoft.com/office/word/2010/wordprocessingDrawing" xmlns:wp="http://schemas.openxmlformats.org/drawingml/2006/wordprocessingDrawing" xmlns:wpg="http://schemas.microsoft.com/office/word/2010/wordprocessingGroup" xmlns:wpi="http://schemas.microsoft.com/office/word/2010/wordprocessingInk" xmlns:wps="http://schemas.microsoft.com/office/word/2010/wordprocessingShape" xmlns:o="urn:schemas-microsoft-com:office:office" xmlns:v="urn:schemas-microsoft-com:vml" xmlns:w10="urn:schemas-microsoft-com:office:word" xmlns:w="http://schemas.openxmlformats.org/wordprocessingml/2006/main" xmlns:w14="http://schemas.microsoft.com/office/word/2010/wordml" xmlns:w15="http://schemas.microsoft.com/office/word/2012/wordml" xmlns:w16cex="http://schemas.microsoft.com/office/word/2018/wordml/cex" xmlns:w16cid="http://schemas.microsoft.com/office/word/2016/wordml/cid" xmlns:w16="http://schemas.microsoft.com/office/word/2018/wordml" xmlns:w16sdtdh="http://schemas.microsoft.com/office/word/2020/wordml/sdtdatahash" xmlns:w16sdtfl="http://schemas.microsoft.com/office/word/2024/wordml/sdtformatlock" xmlns:w16se="http://schemas.microsoft.com/office/word/2015/wordml/symex" xmlns:w16du="http://schemas.microsoft.com/office/word/2023/wordml/word16du" xmlns:wne="http://schemas.microsoft.com/office/word/2006/wordml" mc:Ignorable="w14 w15 w16se w16cid w16 w16cex w16sdtdh w16sdtfl w16du wp14">
   <w:footnote w:type="separator" w:id="-1">
@@ -7128,16 +7105,6 @@
 </file>
 
 <file path=word/header1.xml><?xml version="1.0" encoding="utf-8"?>
-<w:hdr xmlns:wpc="http://schemas.microsoft.com/office/word/2010/wordprocessingCanvas" xmlns:cx="http://schemas.microsoft.com/office/drawing/2014/chartex" xmlns:cx1="http://schemas.microsoft.com/office/drawing/2015/9/8/chartex" xmlns:cx2="http://schemas.microsoft.com/office/drawing/2015/10/21/chartex" xmlns:cx3="http://schemas.microsoft.com/office/drawing/2016/5/9/chartex" xmlns:cx4="http://schemas.microsoft.com/office/drawing/2016/5/10/chartex" xmlns:cx5="http://schemas.microsoft.com/office/drawing/2016/5/11/chartex" xmlns:cx6="http://schemas.microsoft.com/office/drawing/2016/5/12/chartex" xmlns:cx7="http://schemas.microsoft.com/office/drawing/2016/5/13/chartex" xmlns:cx8="http://schemas.microsoft.com/office/drawing/2016/5/14/chartex" xmlns:mc="http://schemas.openxmlformats.org/markup-compatibility/2006" xmlns:m="http://schemas.openxmlformats.org/officeDocument/2006/math" xmlns:aink="http://schemas.microsoft.com/office/drawing/2016/ink" xmlns:am3d="http://schemas.microsoft.com/office/drawing/2017/model3d" xmlns:oel="http://schemas.microsoft.com/office/2019/extlst" xmlns:r="http://schemas.openxmlformats.org/officeDocument/2006/relationships" xmlns:wp14="http://schemas.microsoft.com/office/word/2010/wordprocessingDrawing" xmlns:wp="http://schemas.openxmlformats.org/drawingml/2006/wordprocessingDrawing" xmlns:wpg="http://schemas.microsoft.com/office/word/2010/wordprocessingGroup" xmlns:wpi="http://schemas.microsoft.com/office/word/2010/wordprocessingInk" xmlns:wps="http://schemas.microsoft.com/office/word/2010/wordprocessingShape" xmlns:o="urn:schemas-microsoft-com:office:office" xmlns:v="urn:schemas-microsoft-com:vml" xmlns:w10="urn:schemas-microsoft-com:office:word" xmlns:w="http://schemas.openxmlformats.org/wordprocessingml/2006/main" xmlns:w14="http://schemas.microsoft.com/office/word/2010/wordml" xmlns:w15="http://schemas.microsoft.com/office/word/2012/wordml" xmlns:w16cex="http://schemas.microsoft.com/office/word/2018/wordml/cex" xmlns:w16cid="http://schemas.microsoft.com/office/word/2016/wordml/cid" xmlns:w16="http://schemas.microsoft.com/office/word/2018/wordml" xmlns:w16sdtdh="http://schemas.microsoft.com/office/word/2020/wordml/sdtdatahash" xmlns:w16sdtfl="http://schemas.microsoft.com/office/word/2024/wordml/sdtformatlock" xmlns:w16se="http://schemas.microsoft.com/office/word/2015/wordml/symex" xmlns:w16du="http://schemas.microsoft.com/office/word/2023/wordml/word16du" xmlns:wne="http://schemas.microsoft.com/office/word/2006/wordml" mc:Ignorable="w14 w15 w16se w16cid w16 w16cex w16sdtdh w16sdtfl w16du wp14">
-  <w:p>
-    <w:pPr>
-      <w:pStyle w:val="Header"/>
-    </w:pPr>
-  </w:p>
-</w:hdr>
-</file>
-
-<file path=word/header2.xml><?xml version="1.0" encoding="utf-8"?>
 <w:hdr xmlns:wpc="http://schemas.microsoft.com/office/word/2010/wordprocessingCanvas" xmlns:cx="http://schemas.microsoft.com/office/drawing/2014/chartex" xmlns:cx1="http://schemas.microsoft.com/office/drawing/2015/9/8/chartex" xmlns:cx2="http://schemas.microsoft.com/office/drawing/2015/10/21/chartex" xmlns:cx3="http://schemas.microsoft.com/office/drawing/2016/5/9/chartex" xmlns:cx4="http://schemas.microsoft.com/office/drawing/2016/5/10/chartex" xmlns:cx5="http://schemas.microsoft.com/office/drawing/2016/5/11/chartex" xmlns:cx6="http://schemas.microsoft.com/office/drawing/2016/5/12/chartex" xmlns:cx7="http://schemas.microsoft.com/office/drawing/2016/5/13/chartex" xmlns:cx8="http://schemas.microsoft.com/office/drawing/2016/5/14/chartex" xmlns:mc="http://schemas.openxmlformats.org/markup-compatibility/2006" xmlns:m="http://schemas.openxmlformats.org/officeDocument/2006/math" xmlns:aink="http://schemas.microsoft.com/office/drawing/2016/ink" xmlns:am3d="http://schemas.microsoft.com/office/drawing/2017/model3d" xmlns:oel="http://schemas.microsoft.com/office/2019/extlst" xmlns:r="http://schemas.openxmlformats.org/officeDocument/2006/relationships" xmlns:wp14="http://schemas.microsoft.com/office/word/2010/wordprocessingDrawing" xmlns:wp="http://schemas.openxmlformats.org/drawingml/2006/wordprocessingDrawing" xmlns:wpg="http://schemas.microsoft.com/office/word/2010/wordprocessingGroup" xmlns:wpi="http://schemas.microsoft.com/office/word/2010/wordprocessingInk" xmlns:wps="http://schemas.microsoft.com/office/word/2010/wordprocessingShape" xmlns:o="urn:schemas-microsoft-com:office:office" xmlns:v="urn:schemas-microsoft-com:vml" xmlns:w10="urn:schemas-microsoft-com:office:word" xmlns:w="http://schemas.openxmlformats.org/wordprocessingml/2006/main" xmlns:w14="http://schemas.microsoft.com/office/word/2010/wordml" xmlns:w15="http://schemas.microsoft.com/office/word/2012/wordml" xmlns:w16cex="http://schemas.microsoft.com/office/word/2018/wordml/cex" xmlns:w16cid="http://schemas.microsoft.com/office/word/2016/wordml/cid" xmlns:w16="http://schemas.microsoft.com/office/word/2018/wordml" xmlns:w16sdtdh="http://schemas.microsoft.com/office/word/2020/wordml/sdtdatahash" xmlns:w16sdtfl="http://schemas.microsoft.com/office/word/2024/wordml/sdtformatlock" xmlns:w16se="http://schemas.microsoft.com/office/word/2015/wordml/symex" xmlns:w16du="http://schemas.microsoft.com/office/word/2023/wordml/word16du" xmlns:wne="http://schemas.microsoft.com/office/word/2006/wordml" mc:Ignorable="w14 w15 w16se w16cid w16 w16cex w16sdtdh w16sdtfl w16du wp14">
   <w:p>
     <w:pPr>
@@ -7273,7 +7240,7 @@
         <w:sz w:val="20"/>
         <w:szCs w:val="20"/>
       </w:rPr>
-      <w:t>1</w:t>
+      <w:t>2</w:t>
     </w:r>
     <w:r>
       <w:rPr>
@@ -7315,16 +7282,6 @@
       </w:rPr>
       <w:t>6</w:t>
     </w:r>
-  </w:p>
-</w:hdr>
-</file>
-
-<file path=word/header3.xml><?xml version="1.0" encoding="utf-8"?>
-<w:hdr xmlns:wpc="http://schemas.microsoft.com/office/word/2010/wordprocessingCanvas" xmlns:cx="http://schemas.microsoft.com/office/drawing/2014/chartex" xmlns:cx1="http://schemas.microsoft.com/office/drawing/2015/9/8/chartex" xmlns:cx2="http://schemas.microsoft.com/office/drawing/2015/10/21/chartex" xmlns:cx3="http://schemas.microsoft.com/office/drawing/2016/5/9/chartex" xmlns:cx4="http://schemas.microsoft.com/office/drawing/2016/5/10/chartex" xmlns:cx5="http://schemas.microsoft.com/office/drawing/2016/5/11/chartex" xmlns:cx6="http://schemas.microsoft.com/office/drawing/2016/5/12/chartex" xmlns:cx7="http://schemas.microsoft.com/office/drawing/2016/5/13/chartex" xmlns:cx8="http://schemas.microsoft.com/office/drawing/2016/5/14/chartex" xmlns:mc="http://schemas.openxmlformats.org/markup-compatibility/2006" xmlns:m="http://schemas.openxmlformats.org/officeDocument/2006/math" xmlns:aink="http://schemas.microsoft.com/office/drawing/2016/ink" xmlns:am3d="http://schemas.microsoft.com/office/drawing/2017/model3d" xmlns:oel="http://schemas.microsoft.com/office/2019/extlst" xmlns:r="http://schemas.openxmlformats.org/officeDocument/2006/relationships" xmlns:wp14="http://schemas.microsoft.com/office/word/2010/wordprocessingDrawing" xmlns:wp="http://schemas.openxmlformats.org/drawingml/2006/wordprocessingDrawing" xmlns:wpg="http://schemas.microsoft.com/office/word/2010/wordprocessingGroup" xmlns:wpi="http://schemas.microsoft.com/office/word/2010/wordprocessingInk" xmlns:wps="http://schemas.microsoft.com/office/word/2010/wordprocessingShape" xmlns:o="urn:schemas-microsoft-com:office:office" xmlns:v="urn:schemas-microsoft-com:vml" xmlns:w10="urn:schemas-microsoft-com:office:word" xmlns:w="http://schemas.openxmlformats.org/wordprocessingml/2006/main" xmlns:w14="http://schemas.microsoft.com/office/word/2010/wordml" xmlns:w15="http://schemas.microsoft.com/office/word/2012/wordml" xmlns:w16cex="http://schemas.microsoft.com/office/word/2018/wordml/cex" xmlns:w16cid="http://schemas.microsoft.com/office/word/2016/wordml/cid" xmlns:w16="http://schemas.microsoft.com/office/word/2018/wordml" xmlns:w16sdtdh="http://schemas.microsoft.com/office/word/2020/wordml/sdtdatahash" xmlns:w16sdtfl="http://schemas.microsoft.com/office/word/2024/wordml/sdtformatlock" xmlns:w16se="http://schemas.microsoft.com/office/word/2015/wordml/symex" xmlns:w16du="http://schemas.microsoft.com/office/word/2023/wordml/word16du" xmlns:wne="http://schemas.microsoft.com/office/word/2006/wordml" mc:Ignorable="w14 w15 w16se w16cid w16 w16cex w16sdtdh w16sdtfl w16du wp14">
-  <w:p>
-    <w:pPr>
-      <w:pStyle w:val="Header"/>
-    </w:pPr>
   </w:p>
 </w:hdr>
 </file>

</xml_diff>